<commit_message>
refactor(docs): rename Bearingworld to Ringworld en todos los documentos
- Cambiar nombres de archivo: Rinworld -> Ringworld (11 .md files)
- Cambiar contenido: Bearingworld -> Ringworld en todo el contenido
- Procesados archivos .md y .docx en la carpeta docs/

Co-Authored-By: Claude Haiku 4.5 <noreply@anthropic.com>
</commit_message>
<xml_diff>
--- a/docs/Stack_Tech_V1.2.docx
+++ b/docs/Stack_Tech_V1.2.docx
@@ -1371,7 +1371,7 @@
       </w:r>
       <w:proofErr w:type="spellEnd"/>
       <w:r>
-        <w:t xml:space="preserve"> tecnológico de Bearingworld.io v1.2. No es una iteración cosmética del Tech Stack v1.1: se ha razonado capa por capa partiendo de los requisitos de producto (PRD v1.1), de la decisión estratégica de arquitectura conversacional, y del contrato criptográfico de ADR-001. El Tech Stack v1.1 se usa únicamente como punto de comparación al final de cada capa, nunca como punto de partida.</w:t>
+        <w:t xml:space="preserve"> tecnológico de Ringworld.io v1.2. No es una iteración cosmética del Tech Stack v1.1: se ha razonado capa por capa partiendo de los requisitos de producto (PRD v1.1), de la decisión estratégica de arquitectura conversacional, y del contrato criptográfico de ADR-001. El Tech Stack v1.1 se usa únicamente como punto de comparación al final de cada capa, nunca como punto de partida.</w:t>
       </w:r>
     </w:p>
     <w:p>
@@ -1379,7 +1379,7 @@
         <w:spacing w:after="120" w:line="276" w:lineRule="auto"/>
       </w:pPr>
       <w:r>
-        <w:t xml:space="preserve">La premisa de producto condiciona todo lo demás: Bearingworld.io desplaza a </w:t>
+        <w:t xml:space="preserve">La premisa de producto condiciona todo lo demás: Ringworld.io desplaza a </w:t>
       </w:r>
       <w:proofErr w:type="spellStart"/>
       <w:r>
@@ -2336,7 +2336,7 @@
       </w:r>
       <w:proofErr w:type="spellEnd"/>
       <w:r>
-        <w:t xml:space="preserve"> de Bearingworld.io es el único lugar donde el texto en claro de los datos comerciales existe. Esto invierte la prioridad habitual: el cliente no es una capa de presentación, es la frontera de seguridad. Por eso (1) toda operación criptográfica corre en el navegador con </w:t>
+        <w:t xml:space="preserve"> de Ringworld.io es el único lugar donde el texto en claro de los datos comerciales existe. Esto invierte la prioridad habitual: el cliente no es una capa de presentación, es la frontera de seguridad. Por eso (1) toda operación criptográfica corre en el navegador con </w:t>
       </w:r>
       <w:proofErr w:type="spellStart"/>
       <w:r>
@@ -4104,7 +4104,7 @@
         <w:t xml:space="preserve">Justificación: </w:t>
       </w:r>
       <w:r>
-        <w:t xml:space="preserve">Esta es la fábrica que construye Bearingworld.io, no parte del producto en </w:t>
+        <w:t xml:space="preserve">Esta es la fábrica que construye Ringworld.io, no parte del producto en </w:t>
       </w:r>
       <w:proofErr w:type="spellStart"/>
       <w:r>
@@ -12600,7 +12600,7 @@
         <w:sz w:val="16"/>
         <w:szCs w:val="16"/>
       </w:rPr>
-      <w:t>Bearingworld.io — Stack Tecnológico v1.2 · CONFIDENCIAL</w:t>
+      <w:t>Ringworld.io — Stack Tecnológico v1.2 · CONFIDENCIAL</w:t>
     </w:r>
   </w:p>
 </w:hdr>

</xml_diff>